<commit_message>
Corrige marca para NTICS no briefing do fotografo (Projeto 132)
Co-Authored-By: Claude Opus 4.8 <noreply@anthropic.com>
Claude-Session: https://claude.ai/code/session_01EwNc3uwMeBDnwNyqeypgcv
</commit_message>
<xml_diff>
--- a/marketing/briefings-videomaker/2026-05-04/Briefing_Fotografo_132_Estacao_Samarco_Culinaria.docx
+++ b/marketing/briefings-videomaker/2026-05-04/Briefing_Fotografo_132_Estacao_Samarco_Culinaria.docx
@@ -764,7 +764,7 @@
           <w:color w:val="1B5E20"/>
           <w:sz w:val="26"/>
         </w:rPr>
-        <w:t xml:space="preserve">  🏷️ IDENTIDADE VISUAL DA MARCA (Denetix)</w:t>
+        <w:t xml:space="preserve">  🏷️ IDENTIDADE VISUAL DA MARCA (NTICS)</w:t>
       </w:r>
     </w:p>
     <w:p>
@@ -777,7 +777,7 @@
           <w:i w:val="0"/>
           <w:sz w:val="22"/>
         </w:rPr>
-        <w:t>Captações específicas (foto e vídeo) focando o material visual da marca Denetix:</w:t>
+        <w:t>Captações específicas (foto e vídeo) focando o material visual da marca NTICS:</w:t>
       </w:r>
     </w:p>
     <w:p>
@@ -1482,7 +1482,7 @@
         <w:rPr>
           <w:sz w:val="22"/>
         </w:rPr>
-        <w:t>Material de marca: wind banner, backdrop + logo Denetix, rollups</w:t>
+        <w:t>Material de marca: wind banner, backdrop + logo NTICS, rollups</w:t>
       </w:r>
     </w:p>
     <w:p>

</xml_diff>